<commit_message>
Add per-act CNSS fee ledger (أتعاب) to the webapp
Ports the desktop's per-card fee/VAT billing into modern_app so each
بطاقة جبر carries its fee statement (الأجور / أ ق م / مصاريف) and prints
it on the محضر.

- cnss.js: extend OEUVRE_COLS with fee_* + vat_rate; add fee math and
  fee fields to buildActRecord; nullGetter on renderActs.
- RegistreCNSSDetail.jsx: collapsible fee statement in the card modal
  with live subtotals/VAT/grand total; persist derived fee_aqm/vat_rate.
- template_cnss.docx: splice in the fee table before {/acts}, preserving
  the webapp's hardcoded letterhead (reproducible via
  add_fee_table_to_template.js, also called from build_cnss_template.js).
- add_cnss_fee_columns.js: idempotent migration for the new columns
  (already applied to Postgres).

Co-Authored-By: Claude Opus 4.8 <noreply@anthropic.com>
</commit_message>
<xml_diff>
--- a/server/assets/template_cnss.docx
+++ b/server/assets/template_cnss.docx
@@ -1733,6 +1733,555 @@
         <w:tab/>
       </w:r>
     </w:p>
+    <w:tbl>
+      <w:tblPr>
+        <w:tblStyle w:val="Grilledutableau"/>
+        <w:tblW w:w="10212" w:type="dxa"/>
+        <w:jc w:val="center"/>
+        <w:tblLayout w:type="fixed"/>
+        <w:tblLook w:val="04A0" w:firstRow="1" w:lastRow="0" w:firstColumn="1" w:lastColumn="0" w:noHBand="0" w:noVBand="1"/>
+      </w:tblPr>
+      <w:tblGrid>
+        <w:gridCol w:w="851"/>
+        <w:gridCol w:w="851"/>
+        <w:gridCol w:w="851"/>
+        <w:gridCol w:w="851"/>
+        <w:gridCol w:w="851"/>
+        <w:gridCol w:w="851"/>
+        <w:gridCol w:w="851"/>
+        <w:gridCol w:w="851"/>
+        <w:gridCol w:w="851"/>
+        <w:gridCol w:w="851"/>
+        <w:gridCol w:w="851"/>
+        <w:gridCol w:w="851"/>
+      </w:tblGrid>
+      <w:tr>
+        <w:trPr>
+          <w:jc w:val="center"/>
+        </w:trPr>
+        <w:tc>
+          <w:tcPr>
+            <w:tcW w:w="851" w:type="dxa"/>
+            <w:vAlign w:val="center"/>
+          </w:tcPr>
+          <w:p>
+            <w:pPr>
+              <w:pStyle w:val="Pieddepage"/>
+              <w:jc w:val="center"/>
+              <w:rPr>
+                <w:rFonts w:asciiTheme="majorBidi" w:hAnsiTheme="majorBidi" w:cstheme="majorBidi"/>
+                <w:sz w:val="20"/>
+                <w:szCs w:val="20"/>
+              </w:rPr>
+            </w:pPr>
+            <w:r>
+              <w:rPr>
+                <w:rFonts w:asciiTheme="majorBidi" w:hAnsiTheme="majorBidi" w:cstheme="majorBidi"/>
+                <w:sz w:val="20"/>
+                <w:szCs w:val="20"/>
+                <w:rtl/>
+              </w:rPr>
+              <w:t>المجموع</w:t>
+            </w:r>
+          </w:p>
+        </w:tc>
+        <w:tc>
+          <w:tcPr>
+            <w:tcW w:w="851" w:type="dxa"/>
+            <w:vAlign w:val="center"/>
+          </w:tcPr>
+          <w:p>
+            <w:pPr>
+              <w:pStyle w:val="Pieddepage"/>
+              <w:jc w:val="center"/>
+              <w:rPr>
+                <w:rFonts w:asciiTheme="majorBidi" w:hAnsiTheme="majorBidi" w:cstheme="majorBidi"/>
+                <w:sz w:val="20"/>
+                <w:szCs w:val="20"/>
+              </w:rPr>
+            </w:pPr>
+            <w:r>
+              <w:rPr>
+                <w:rFonts w:asciiTheme="majorBidi" w:hAnsiTheme="majorBidi" w:cstheme="majorBidi"/>
+                <w:sz w:val="20"/>
+                <w:szCs w:val="20"/>
+                <w:rtl/>
+              </w:rPr>
+              <w:t>البريد</w:t>
+            </w:r>
+          </w:p>
+        </w:tc>
+        <w:tc>
+          <w:tcPr>
+            <w:tcW w:w="851" w:type="dxa"/>
+            <w:vAlign w:val="center"/>
+          </w:tcPr>
+          <w:p>
+            <w:pPr>
+              <w:pStyle w:val="Pieddepage"/>
+              <w:jc w:val="center"/>
+              <w:rPr>
+                <w:rFonts w:asciiTheme="majorBidi" w:hAnsiTheme="majorBidi" w:cstheme="majorBidi"/>
+                <w:sz w:val="20"/>
+                <w:szCs w:val="20"/>
+              </w:rPr>
+            </w:pPr>
+            <w:r>
+              <w:rPr>
+                <w:rFonts w:asciiTheme="majorBidi" w:hAnsiTheme="majorBidi" w:cstheme="majorBidi"/>
+                <w:sz w:val="20"/>
+                <w:szCs w:val="20"/>
+                <w:rtl/>
+              </w:rPr>
+              <w:t>الترسيم</w:t>
+            </w:r>
+          </w:p>
+        </w:tc>
+        <w:tc>
+          <w:tcPr>
+            <w:tcW w:w="851" w:type="dxa"/>
+            <w:vAlign w:val="center"/>
+          </w:tcPr>
+          <w:p>
+            <w:pPr>
+              <w:pStyle w:val="Pieddepage"/>
+              <w:jc w:val="center"/>
+              <w:rPr>
+                <w:rFonts w:asciiTheme="majorBidi" w:hAnsiTheme="majorBidi" w:cstheme="majorBidi"/>
+                <w:sz w:val="20"/>
+                <w:szCs w:val="20"/>
+              </w:rPr>
+            </w:pPr>
+            <w:r>
+              <w:rPr>
+                <w:rFonts w:asciiTheme="majorBidi" w:hAnsiTheme="majorBidi" w:cstheme="majorBidi"/>
+                <w:sz w:val="20"/>
+                <w:szCs w:val="20"/>
+                <w:rtl/>
+              </w:rPr>
+              <w:t>التسجيل</w:t>
+            </w:r>
+          </w:p>
+        </w:tc>
+        <w:tc>
+          <w:tcPr>
+            <w:tcW w:w="851" w:type="dxa"/>
+            <w:vAlign w:val="center"/>
+          </w:tcPr>
+          <w:p>
+            <w:pPr>
+              <w:pStyle w:val="Pieddepage"/>
+              <w:jc w:val="center"/>
+              <w:rPr>
+                <w:rFonts w:asciiTheme="majorBidi" w:hAnsiTheme="majorBidi" w:cstheme="majorBidi"/>
+                <w:sz w:val="20"/>
+                <w:szCs w:val="20"/>
+              </w:rPr>
+            </w:pPr>
+            <w:r>
+              <w:rPr>
+                <w:rFonts w:asciiTheme="majorBidi" w:hAnsiTheme="majorBidi" w:cstheme="majorBidi"/>
+                <w:sz w:val="20"/>
+                <w:szCs w:val="20"/>
+                <w:rtl/>
+              </w:rPr>
+              <w:t>التنقل</w:t>
+            </w:r>
+          </w:p>
+        </w:tc>
+        <w:tc>
+          <w:tcPr>
+            <w:tcW w:w="851" w:type="dxa"/>
+            <w:vAlign w:val="center"/>
+          </w:tcPr>
+          <w:p>
+            <w:pPr>
+              <w:pStyle w:val="Pieddepage"/>
+              <w:jc w:val="center"/>
+              <w:rPr>
+                <w:rFonts w:asciiTheme="majorBidi" w:hAnsiTheme="majorBidi" w:cstheme="majorBidi"/>
+                <w:sz w:val="20"/>
+                <w:szCs w:val="20"/>
+              </w:rPr>
+            </w:pPr>
+            <w:r>
+              <w:rPr>
+                <w:rFonts w:asciiTheme="majorBidi" w:hAnsiTheme="majorBidi" w:cstheme="majorBidi"/>
+                <w:sz w:val="20"/>
+                <w:szCs w:val="20"/>
+                <w:rtl/>
+              </w:rPr>
+              <w:t>أ ق م</w:t>
+            </w:r>
+          </w:p>
+        </w:tc>
+        <w:tc>
+          <w:tcPr>
+            <w:tcW w:w="851" w:type="dxa"/>
+            <w:vAlign w:val="center"/>
+          </w:tcPr>
+          <w:p>
+            <w:pPr>
+              <w:pStyle w:val="Pieddepage"/>
+              <w:jc w:val="center"/>
+              <w:rPr>
+                <w:rFonts w:asciiTheme="majorBidi" w:hAnsiTheme="majorBidi" w:cstheme="majorBidi"/>
+                <w:sz w:val="20"/>
+                <w:szCs w:val="20"/>
+              </w:rPr>
+            </w:pPr>
+            <w:r>
+              <w:rPr>
+                <w:rFonts w:asciiTheme="majorBidi" w:hAnsiTheme="majorBidi" w:cstheme="majorBidi"/>
+                <w:sz w:val="20"/>
+                <w:szCs w:val="20"/>
+                <w:rtl/>
+              </w:rPr>
+              <w:t>نسخ الأوراق</w:t>
+            </w:r>
+          </w:p>
+        </w:tc>
+        <w:tc>
+          <w:tcPr>
+            <w:tcW w:w="851" w:type="dxa"/>
+            <w:vAlign w:val="center"/>
+          </w:tcPr>
+          <w:p>
+            <w:pPr>
+              <w:pStyle w:val="Pieddepage"/>
+              <w:jc w:val="center"/>
+              <w:rPr>
+                <w:rFonts w:asciiTheme="majorBidi" w:hAnsiTheme="majorBidi" w:cstheme="majorBidi"/>
+                <w:sz w:val="20"/>
+                <w:szCs w:val="20"/>
+              </w:rPr>
+            </w:pPr>
+            <w:r>
+              <w:rPr>
+                <w:rFonts w:asciiTheme="majorBidi" w:hAnsiTheme="majorBidi" w:cstheme="majorBidi"/>
+                <w:sz w:val="20"/>
+                <w:szCs w:val="20"/>
+                <w:rtl/>
+              </w:rPr>
+              <w:t>التوجه</w:t>
+            </w:r>
+          </w:p>
+        </w:tc>
+        <w:tc>
+          <w:tcPr>
+            <w:tcW w:w="851" w:type="dxa"/>
+            <w:vAlign w:val="center"/>
+          </w:tcPr>
+          <w:p>
+            <w:pPr>
+              <w:pStyle w:val="Pieddepage"/>
+              <w:jc w:val="center"/>
+              <w:rPr>
+                <w:rFonts w:asciiTheme="majorBidi" w:hAnsiTheme="majorBidi" w:cstheme="majorBidi"/>
+                <w:sz w:val="20"/>
+                <w:szCs w:val="20"/>
+              </w:rPr>
+            </w:pPr>
+            <w:r>
+              <w:rPr>
+                <w:rFonts w:asciiTheme="majorBidi" w:hAnsiTheme="majorBidi" w:cstheme="majorBidi"/>
+                <w:sz w:val="20"/>
+                <w:szCs w:val="20"/>
+                <w:rtl/>
+              </w:rPr>
+              <w:t>النسخة المكتبية</w:t>
+            </w:r>
+          </w:p>
+        </w:tc>
+        <w:tc>
+          <w:tcPr>
+            <w:tcW w:w="851" w:type="dxa"/>
+          </w:tcPr>
+          <w:p>
+            <w:pPr>
+              <w:pStyle w:val="Pieddepage"/>
+              <w:jc w:val="center"/>
+              <w:rPr>
+                <w:rFonts w:asciiTheme="majorBidi" w:hAnsiTheme="majorBidi" w:cstheme="majorBidi"/>
+                <w:sz w:val="20"/>
+                <w:szCs w:val="20"/>
+                <w:rtl/>
+              </w:rPr>
+            </w:pPr>
+            <w:r>
+              <w:rPr>
+                <w:rFonts w:asciiTheme="majorBidi" w:hAnsiTheme="majorBidi" w:cstheme="majorBidi" w:hint="cs"/>
+                <w:sz w:val="20"/>
+                <w:szCs w:val="20"/>
+                <w:rtl/>
+              </w:rPr>
+              <w:t>النسخة القانونية</w:t>
+            </w:r>
+          </w:p>
+        </w:tc>
+        <w:tc>
+          <w:tcPr>
+            <w:tcW w:w="851" w:type="dxa"/>
+            <w:vAlign w:val="center"/>
+          </w:tcPr>
+          <w:p>
+            <w:pPr>
+              <w:pStyle w:val="Pieddepage"/>
+              <w:jc w:val="center"/>
+              <w:rPr>
+                <w:rFonts w:asciiTheme="majorBidi" w:hAnsiTheme="majorBidi" w:cstheme="majorBidi"/>
+                <w:sz w:val="20"/>
+                <w:szCs w:val="20"/>
+              </w:rPr>
+            </w:pPr>
+            <w:r>
+              <w:rPr>
+                <w:rFonts w:asciiTheme="majorBidi" w:hAnsiTheme="majorBidi" w:cstheme="majorBidi"/>
+                <w:sz w:val="20"/>
+                <w:szCs w:val="20"/>
+                <w:rtl/>
+              </w:rPr>
+              <w:t>النظائر</w:t>
+            </w:r>
+          </w:p>
+        </w:tc>
+        <w:tc>
+          <w:tcPr>
+            <w:tcW w:w="851" w:type="dxa"/>
+            <w:vAlign w:val="center"/>
+          </w:tcPr>
+          <w:p>
+            <w:pPr>
+              <w:pStyle w:val="Pieddepage"/>
+              <w:jc w:val="center"/>
+              <w:rPr>
+                <w:rFonts w:asciiTheme="majorBidi" w:hAnsiTheme="majorBidi" w:cstheme="majorBidi"/>
+                <w:sz w:val="20"/>
+                <w:szCs w:val="20"/>
+              </w:rPr>
+            </w:pPr>
+            <w:r>
+              <w:rPr>
+                <w:rFonts w:asciiTheme="majorBidi" w:hAnsiTheme="majorBidi" w:cstheme="majorBidi"/>
+                <w:sz w:val="20"/>
+                <w:szCs w:val="20"/>
+                <w:rtl/>
+              </w:rPr>
+              <w:t>أصل المحضر</w:t>
+            </w:r>
+          </w:p>
+        </w:tc>
+      </w:tr>
+      <w:tr>
+        <w:trPr>
+          <w:jc w:val="center"/>
+        </w:trPr>
+        <w:tc>
+          <w:tcPr>
+            <w:tcW w:w="851" w:type="dxa"/>
+          </w:tcPr>
+          <w:p>
+            <w:pPr>
+              <w:pStyle w:val="Pieddepage"/>
+              <w:jc w:val="center"/>
+            </w:pPr>
+            <w:r>
+              <w:rPr>
+                <w:rFonts w:hint="cs"/>
+                <w:rtl/>
+              </w:rPr>
+              <w:t>{fee_total}</w:t>
+            </w:r>
+          </w:p>
+        </w:tc>
+        <w:tc>
+          <w:tcPr>
+            <w:tcW w:w="851" w:type="dxa"/>
+          </w:tcPr>
+          <w:p>
+            <w:pPr>
+              <w:pStyle w:val="Pieddepage"/>
+              <w:jc w:val="center"/>
+            </w:pPr>
+            <w:r>
+              <w:rPr>
+                <w:rFonts w:hint="cs"/>
+                <w:rtl/>
+              </w:rPr>
+              <w:t>{fee_post}</w:t>
+            </w:r>
+          </w:p>
+        </w:tc>
+        <w:tc>
+          <w:tcPr>
+            <w:tcW w:w="851" w:type="dxa"/>
+          </w:tcPr>
+          <w:p>
+            <w:pPr>
+              <w:pStyle w:val="Pieddepage"/>
+              <w:jc w:val="center"/>
+            </w:pPr>
+            <w:r>
+              <w:rPr>
+                <w:rFonts w:hint="cs"/>
+                <w:rtl/>
+              </w:rPr>
+              <w:t>{fee_stamp}</w:t>
+            </w:r>
+          </w:p>
+        </w:tc>
+        <w:tc>
+          <w:tcPr>
+            <w:tcW w:w="851" w:type="dxa"/>
+          </w:tcPr>
+          <w:p>
+            <w:pPr>
+              <w:pStyle w:val="Pieddepage"/>
+              <w:jc w:val="center"/>
+            </w:pPr>
+            <w:r>
+              <w:rPr>
+                <w:rFonts w:hint="cs"/>
+                <w:rtl/>
+              </w:rPr>
+              <w:t>{fee_registration}</w:t>
+            </w:r>
+          </w:p>
+        </w:tc>
+        <w:tc>
+          <w:tcPr>
+            <w:tcW w:w="851" w:type="dxa"/>
+          </w:tcPr>
+          <w:p>
+            <w:pPr>
+              <w:pStyle w:val="Pieddepage"/>
+              <w:jc w:val="center"/>
+            </w:pPr>
+            <w:r>
+              <w:rPr>
+                <w:rFonts w:hint="cs"/>
+                <w:rtl/>
+              </w:rPr>
+              <w:t>{fee_travel}</w:t>
+            </w:r>
+          </w:p>
+        </w:tc>
+        <w:tc>
+          <w:tcPr>
+            <w:tcW w:w="851" w:type="dxa"/>
+          </w:tcPr>
+          <w:p>
+            <w:pPr>
+              <w:pStyle w:val="Pieddepage"/>
+              <w:jc w:val="center"/>
+            </w:pPr>
+            <w:r>
+              <w:rPr>
+                <w:rFonts w:hint="cs"/>
+                <w:rtl/>
+              </w:rPr>
+              <w:t>{fee_aqm}</w:t>
+            </w:r>
+          </w:p>
+        </w:tc>
+        <w:tc>
+          <w:tcPr>
+            <w:tcW w:w="851" w:type="dxa"/>
+          </w:tcPr>
+          <w:p>
+            <w:pPr>
+              <w:pStyle w:val="Pieddepage"/>
+              <w:jc w:val="center"/>
+            </w:pPr>
+            <w:r>
+              <w:rPr>
+                <w:rFonts w:hint="cs"/>
+                <w:rtl/>
+              </w:rPr>
+              <w:t>{fee_copies}</w:t>
+            </w:r>
+          </w:p>
+        </w:tc>
+        <w:tc>
+          <w:tcPr>
+            <w:tcW w:w="851" w:type="dxa"/>
+          </w:tcPr>
+          <w:p>
+            <w:pPr>
+              <w:pStyle w:val="Pieddepage"/>
+              <w:jc w:val="center"/>
+            </w:pPr>
+            <w:r>
+              <w:rPr>
+                <w:rFonts w:hint="cs"/>
+                <w:rtl/>
+              </w:rPr>
+              <w:t>{fee_movement}</w:t>
+            </w:r>
+          </w:p>
+        </w:tc>
+        <w:tc>
+          <w:tcPr>
+            <w:tcW w:w="851" w:type="dxa"/>
+          </w:tcPr>
+          <w:p>
+            <w:pPr>
+              <w:pStyle w:val="Pieddepage"/>
+              <w:jc w:val="center"/>
+            </w:pPr>
+            <w:r>
+              <w:t>{fee_office_copy}</w:t>
+            </w:r>
+          </w:p>
+        </w:tc>
+        <w:tc>
+          <w:tcPr>
+            <w:tcW w:w="851" w:type="dxa"/>
+          </w:tcPr>
+          <w:p>
+            <w:pPr>
+              <w:pStyle w:val="Pieddepage"/>
+              <w:jc w:val="center"/>
+            </w:pPr>
+            <w:r>
+              <w:t>{fee_legal_copy}</w:t>
+            </w:r>
+          </w:p>
+        </w:tc>
+        <w:tc>
+          <w:tcPr>
+            <w:tcW w:w="851" w:type="dxa"/>
+          </w:tcPr>
+          <w:p>
+            <w:pPr>
+              <w:pStyle w:val="Pieddepage"/>
+              <w:jc w:val="center"/>
+            </w:pPr>
+            <w:r>
+              <w:rPr>
+                <w:rFonts w:hint="cs"/>
+                <w:rtl/>
+              </w:rPr>
+              <w:t>{fee_counterparts}</w:t>
+            </w:r>
+          </w:p>
+        </w:tc>
+        <w:tc>
+          <w:tcPr>
+            <w:tcW w:w="851" w:type="dxa"/>
+          </w:tcPr>
+          <w:p>
+            <w:pPr>
+              <w:pStyle w:val="Pieddepage"/>
+              <w:jc w:val="center"/>
+            </w:pPr>
+            <w:r>
+              <w:t>{fee_original}</w:t>
+            </w:r>
+          </w:p>
+        </w:tc>
+      </w:tr>
+    </w:tbl>
     <w:p>
       <w:r>
         <w:br w:type="page"/>

</xml_diff>

<commit_message>
Clean up محضر generation: drop yellow highlights and the trailing blank page
Two defects in the generated act, both inherited from the authored
mail-merge template:

- The template highlights its variable runs in yellow as a "fill this
  in" marker. build_cnss_template.js stripped that only from the rPr of
  the MERGEFIELD runs it rewrites, so five plain-text runs highlighted
  alongside the fields survived and printed yellow on every act. Strip
  every highlight from the body and any header/footer instead.

- The {#acts} loop ends with a page break so each محضر starts on a fresh
  page. After the last act it has nothing to separate, so Word rendered
  a trailing blank page. renderActs now drops the final break, guarded
  by indexOf so a template that writes breaks differently is untouched.

Verified through renderActs for 1/2/3 acts: page breaks = acts-1, zero
highlights, fee table still last in the act, no unrendered tags.

Co-Authored-By: Claude Opus 5 <noreply@anthropic.com>
</commit_message>
<xml_diff>
--- a/server/assets/template_cnss.docx
+++ b/server/assets/template_cnss.docx
@@ -154,7 +154,6 @@
                 <w:bCs/>
                 <w:sz w:val="24"/>
                 <w:szCs w:val="24"/>
-                <w:highlight w:val="yellow"/>
                 <w:u w:val="single"/>
                 <w:rtl/>
                 <w:lang w:bidi="ar-TN"/>
@@ -168,7 +167,6 @@
                 <w:bCs/>
                 <w:sz w:val="24"/>
                 <w:szCs w:val="24"/>
-                <w:highlight w:val="yellow"/>
                 <w:u w:val="single"/>
                 <w:rtl/>
                 <w:lang w:bidi="ar-TN"/>
@@ -1368,7 +1366,6 @@
                 <w:rFonts w:asciiTheme="majorBidi" w:hAnsiTheme="majorBidi" w:cstheme="majorBidi"/>
                 <w:sz w:val="24"/>
                 <w:szCs w:val="24"/>
-                <w:highlight w:val="yellow"/>
                 <w:rtl/>
                 <w:lang w:bidi="ar-TN"/>
               </w:rPr>
@@ -1434,7 +1431,6 @@
                 <w:rFonts w:asciiTheme="majorBidi" w:hAnsiTheme="majorBidi" w:cstheme="majorBidi"/>
                 <w:sz w:val="24"/>
                 <w:szCs w:val="24"/>
-                <w:highlight w:val="yellow"/>
                 <w:rtl/>
                 <w:lang w:bidi="ar-TN"/>
               </w:rPr>
@@ -1444,7 +1440,6 @@
                 <w:rFonts w:asciiTheme="majorBidi" w:hAnsiTheme="majorBidi" w:cstheme="majorBidi" w:hint="cs"/>
                 <w:sz w:val="24"/>
                 <w:szCs w:val="24"/>
-                <w:highlight w:val="yellow"/>
                 <w:rtl/>
                 <w:lang w:bidi="ar-TN"/>
               </w:rPr>

</xml_diff>

<commit_message>
Remove the duplicate hard-coded fee table from the act footer
The authored template keeps a second copy of the أجور table in
word/footer1.xml with the original author's amounts typed in as literal
text and no merge tags. Word repeats a footer on every page, so that
stale table printed under every act next to the real, per-act one.

add_fee_table_to_template.js only ever spliced a tagged copy into the
body; it never removed the original (the desktop builder does). Strip it
during the build, guarded so only an UNTAGGED footer table is removed
and a correctly tagged one is never touched, and run the cleanup
independently of the "body table already present" early-return so it
also applies to an already-spliced template.

Co-Authored-By: Claude Opus 5 <noreply@anthropic.com>
</commit_message>
<xml_diff>
--- a/server/assets/template_cnss.docx
+++ b/server/assets/template_cnss.docx
@@ -2327,506 +2327,6 @@
 
 <file path=word/footer1.xml><?xml version="1.0" encoding="utf-8"?>
 <w:ftr xmlns:wpc="http://schemas.microsoft.com/office/word/2010/wordprocessingCanvas" xmlns:cx="http://schemas.microsoft.com/office/drawing/2014/chartex" xmlns:cx1="http://schemas.microsoft.com/office/drawing/2015/9/8/chartex" xmlns:cx2="http://schemas.microsoft.com/office/drawing/2015/10/21/chartex" xmlns:cx3="http://schemas.microsoft.com/office/drawing/2016/5/9/chartex" xmlns:cx4="http://schemas.microsoft.com/office/drawing/2016/5/10/chartex" xmlns:cx5="http://schemas.microsoft.com/office/drawing/2016/5/11/chartex" xmlns:cx6="http://schemas.microsoft.com/office/drawing/2016/5/12/chartex" xmlns:cx7="http://schemas.microsoft.com/office/drawing/2016/5/13/chartex" xmlns:cx8="http://schemas.microsoft.com/office/drawing/2016/5/14/chartex" xmlns:mc="http://schemas.openxmlformats.org/markup-compatibility/2006" xmlns:aink="http://schemas.microsoft.com/office/drawing/2016/ink" xmlns:am3d="http://schemas.microsoft.com/office/drawing/2017/model3d" xmlns:o="urn:schemas-microsoft-com:office:office" xmlns:oel="http://schemas.microsoft.com/office/2019/extlst" xmlns:r="http://schemas.openxmlformats.org/officeDocument/2006/relationships" xmlns:m="http://schemas.openxmlformats.org/officeDocument/2006/math" xmlns:v="urn:schemas-microsoft-com:vml" xmlns:wp14="http://schemas.microsoft.com/office/word/2010/wordprocessingDrawing" xmlns:wp="http://schemas.openxmlformats.org/drawingml/2006/wordprocessingDrawing" xmlns:w10="urn:schemas-microsoft-com:office:word" xmlns:w="http://schemas.openxmlformats.org/wordprocessingml/2006/main" xmlns:w14="http://schemas.microsoft.com/office/word/2010/wordml" xmlns:w15="http://schemas.microsoft.com/office/word/2012/wordml" xmlns:w16cex="http://schemas.microsoft.com/office/word/2018/wordml/cex" xmlns:w16cid="http://schemas.microsoft.com/office/word/2016/wordml/cid" xmlns:w16="http://schemas.microsoft.com/office/word/2018/wordml" xmlns:w16du="http://schemas.microsoft.com/office/word/2023/wordml/word16du" xmlns:w16sdtdh="http://schemas.microsoft.com/office/word/2020/wordml/sdtdatahash" xmlns:w16sdtfl="http://schemas.microsoft.com/office/word/2024/wordml/sdtformatlock" xmlns:w16se="http://schemas.microsoft.com/office/word/2015/wordml/symex" xmlns:wpg="http://schemas.microsoft.com/office/word/2010/wordprocessingGroup" xmlns:wpi="http://schemas.microsoft.com/office/word/2010/wordprocessingInk" xmlns:wne="http://schemas.microsoft.com/office/word/2006/wordml" xmlns:wps="http://schemas.microsoft.com/office/word/2010/wordprocessingShape" mc:Ignorable="w14 w15 w16se w16cid w16 w16cex w16sdtdh w16sdtfl w16du wp14">
-  <w:tbl>
-    <w:tblPr>
-      <w:tblStyle w:val="Grilledutableau"/>
-      <w:tblW w:w="10212" w:type="dxa"/>
-      <w:jc w:val="center"/>
-      <w:tblLayout w:type="fixed"/>
-      <w:tblLook w:val="04A0" w:firstRow="1" w:lastRow="0" w:firstColumn="1" w:lastColumn="0" w:noHBand="0" w:noVBand="1"/>
-    </w:tblPr>
-    <w:tblGrid>
-      <w:gridCol w:w="851"/>
-      <w:gridCol w:w="851"/>
-      <w:gridCol w:w="851"/>
-      <w:gridCol w:w="851"/>
-      <w:gridCol w:w="851"/>
-      <w:gridCol w:w="851"/>
-      <w:gridCol w:w="851"/>
-      <w:gridCol w:w="851"/>
-      <w:gridCol w:w="851"/>
-      <w:gridCol w:w="851"/>
-      <w:gridCol w:w="851"/>
-      <w:gridCol w:w="851"/>
-    </w:tblGrid>
-    <w:tr>
-      <w:trPr>
-        <w:jc w:val="center"/>
-      </w:trPr>
-      <w:tc>
-        <w:tcPr>
-          <w:tcW w:w="851" w:type="dxa"/>
-          <w:vAlign w:val="center"/>
-        </w:tcPr>
-        <w:p>
-          <w:pPr>
-            <w:pStyle w:val="Pieddepage"/>
-            <w:jc w:val="center"/>
-            <w:rPr>
-              <w:rFonts w:asciiTheme="majorBidi" w:hAnsiTheme="majorBidi" w:cstheme="majorBidi"/>
-              <w:sz w:val="20"/>
-              <w:szCs w:val="20"/>
-            </w:rPr>
-          </w:pPr>
-          <w:r>
-            <w:rPr>
-              <w:rFonts w:asciiTheme="majorBidi" w:hAnsiTheme="majorBidi" w:cstheme="majorBidi"/>
-              <w:sz w:val="20"/>
-              <w:szCs w:val="20"/>
-              <w:rtl/>
-            </w:rPr>
-            <w:t>المجموع</w:t>
-          </w:r>
-        </w:p>
-      </w:tc>
-      <w:tc>
-        <w:tcPr>
-          <w:tcW w:w="851" w:type="dxa"/>
-          <w:vAlign w:val="center"/>
-        </w:tcPr>
-        <w:p>
-          <w:pPr>
-            <w:pStyle w:val="Pieddepage"/>
-            <w:jc w:val="center"/>
-            <w:rPr>
-              <w:rFonts w:asciiTheme="majorBidi" w:hAnsiTheme="majorBidi" w:cstheme="majorBidi"/>
-              <w:sz w:val="20"/>
-              <w:szCs w:val="20"/>
-            </w:rPr>
-          </w:pPr>
-          <w:r>
-            <w:rPr>
-              <w:rFonts w:asciiTheme="majorBidi" w:hAnsiTheme="majorBidi" w:cstheme="majorBidi"/>
-              <w:sz w:val="20"/>
-              <w:szCs w:val="20"/>
-              <w:rtl/>
-            </w:rPr>
-            <w:t>البريد</w:t>
-          </w:r>
-        </w:p>
-      </w:tc>
-      <w:tc>
-        <w:tcPr>
-          <w:tcW w:w="851" w:type="dxa"/>
-          <w:vAlign w:val="center"/>
-        </w:tcPr>
-        <w:p>
-          <w:pPr>
-            <w:pStyle w:val="Pieddepage"/>
-            <w:jc w:val="center"/>
-            <w:rPr>
-              <w:rFonts w:asciiTheme="majorBidi" w:hAnsiTheme="majorBidi" w:cstheme="majorBidi"/>
-              <w:sz w:val="20"/>
-              <w:szCs w:val="20"/>
-            </w:rPr>
-          </w:pPr>
-          <w:r>
-            <w:rPr>
-              <w:rFonts w:asciiTheme="majorBidi" w:hAnsiTheme="majorBidi" w:cstheme="majorBidi"/>
-              <w:sz w:val="20"/>
-              <w:szCs w:val="20"/>
-              <w:rtl/>
-            </w:rPr>
-            <w:t>الترسيم</w:t>
-          </w:r>
-        </w:p>
-      </w:tc>
-      <w:tc>
-        <w:tcPr>
-          <w:tcW w:w="851" w:type="dxa"/>
-          <w:vAlign w:val="center"/>
-        </w:tcPr>
-        <w:p>
-          <w:pPr>
-            <w:pStyle w:val="Pieddepage"/>
-            <w:jc w:val="center"/>
-            <w:rPr>
-              <w:rFonts w:asciiTheme="majorBidi" w:hAnsiTheme="majorBidi" w:cstheme="majorBidi"/>
-              <w:sz w:val="20"/>
-              <w:szCs w:val="20"/>
-            </w:rPr>
-          </w:pPr>
-          <w:r>
-            <w:rPr>
-              <w:rFonts w:asciiTheme="majorBidi" w:hAnsiTheme="majorBidi" w:cstheme="majorBidi"/>
-              <w:sz w:val="20"/>
-              <w:szCs w:val="20"/>
-              <w:rtl/>
-            </w:rPr>
-            <w:t>التسجيل</w:t>
-          </w:r>
-        </w:p>
-      </w:tc>
-      <w:tc>
-        <w:tcPr>
-          <w:tcW w:w="851" w:type="dxa"/>
-          <w:vAlign w:val="center"/>
-        </w:tcPr>
-        <w:p>
-          <w:pPr>
-            <w:pStyle w:val="Pieddepage"/>
-            <w:jc w:val="center"/>
-            <w:rPr>
-              <w:rFonts w:asciiTheme="majorBidi" w:hAnsiTheme="majorBidi" w:cstheme="majorBidi"/>
-              <w:sz w:val="20"/>
-              <w:szCs w:val="20"/>
-            </w:rPr>
-          </w:pPr>
-          <w:r>
-            <w:rPr>
-              <w:rFonts w:asciiTheme="majorBidi" w:hAnsiTheme="majorBidi" w:cstheme="majorBidi"/>
-              <w:sz w:val="20"/>
-              <w:szCs w:val="20"/>
-              <w:rtl/>
-            </w:rPr>
-            <w:t>التنقل</w:t>
-          </w:r>
-        </w:p>
-      </w:tc>
-      <w:tc>
-        <w:tcPr>
-          <w:tcW w:w="851" w:type="dxa"/>
-          <w:vAlign w:val="center"/>
-        </w:tcPr>
-        <w:p>
-          <w:pPr>
-            <w:pStyle w:val="Pieddepage"/>
-            <w:jc w:val="center"/>
-            <w:rPr>
-              <w:rFonts w:asciiTheme="majorBidi" w:hAnsiTheme="majorBidi" w:cstheme="majorBidi"/>
-              <w:sz w:val="20"/>
-              <w:szCs w:val="20"/>
-            </w:rPr>
-          </w:pPr>
-          <w:r>
-            <w:rPr>
-              <w:rFonts w:asciiTheme="majorBidi" w:hAnsiTheme="majorBidi" w:cstheme="majorBidi"/>
-              <w:sz w:val="20"/>
-              <w:szCs w:val="20"/>
-              <w:rtl/>
-            </w:rPr>
-            <w:t>أ ق م</w:t>
-          </w:r>
-        </w:p>
-      </w:tc>
-      <w:tc>
-        <w:tcPr>
-          <w:tcW w:w="851" w:type="dxa"/>
-          <w:vAlign w:val="center"/>
-        </w:tcPr>
-        <w:p>
-          <w:pPr>
-            <w:pStyle w:val="Pieddepage"/>
-            <w:jc w:val="center"/>
-            <w:rPr>
-              <w:rFonts w:asciiTheme="majorBidi" w:hAnsiTheme="majorBidi" w:cstheme="majorBidi"/>
-              <w:sz w:val="20"/>
-              <w:szCs w:val="20"/>
-            </w:rPr>
-          </w:pPr>
-          <w:r>
-            <w:rPr>
-              <w:rFonts w:asciiTheme="majorBidi" w:hAnsiTheme="majorBidi" w:cstheme="majorBidi"/>
-              <w:sz w:val="20"/>
-              <w:szCs w:val="20"/>
-              <w:rtl/>
-            </w:rPr>
-            <w:t>نسخ الأوراق</w:t>
-          </w:r>
-        </w:p>
-      </w:tc>
-      <w:tc>
-        <w:tcPr>
-          <w:tcW w:w="851" w:type="dxa"/>
-          <w:vAlign w:val="center"/>
-        </w:tcPr>
-        <w:p>
-          <w:pPr>
-            <w:pStyle w:val="Pieddepage"/>
-            <w:jc w:val="center"/>
-            <w:rPr>
-              <w:rFonts w:asciiTheme="majorBidi" w:hAnsiTheme="majorBidi" w:cstheme="majorBidi"/>
-              <w:sz w:val="20"/>
-              <w:szCs w:val="20"/>
-            </w:rPr>
-          </w:pPr>
-          <w:r>
-            <w:rPr>
-              <w:rFonts w:asciiTheme="majorBidi" w:hAnsiTheme="majorBidi" w:cstheme="majorBidi"/>
-              <w:sz w:val="20"/>
-              <w:szCs w:val="20"/>
-              <w:rtl/>
-            </w:rPr>
-            <w:t>التوجه</w:t>
-          </w:r>
-        </w:p>
-      </w:tc>
-      <w:tc>
-        <w:tcPr>
-          <w:tcW w:w="851" w:type="dxa"/>
-          <w:vAlign w:val="center"/>
-        </w:tcPr>
-        <w:p>
-          <w:pPr>
-            <w:pStyle w:val="Pieddepage"/>
-            <w:jc w:val="center"/>
-            <w:rPr>
-              <w:rFonts w:asciiTheme="majorBidi" w:hAnsiTheme="majorBidi" w:cstheme="majorBidi"/>
-              <w:sz w:val="20"/>
-              <w:szCs w:val="20"/>
-            </w:rPr>
-          </w:pPr>
-          <w:r>
-            <w:rPr>
-              <w:rFonts w:asciiTheme="majorBidi" w:hAnsiTheme="majorBidi" w:cstheme="majorBidi"/>
-              <w:sz w:val="20"/>
-              <w:szCs w:val="20"/>
-              <w:rtl/>
-            </w:rPr>
-            <w:t>النسخة المكتبية</w:t>
-          </w:r>
-        </w:p>
-      </w:tc>
-      <w:tc>
-        <w:tcPr>
-          <w:tcW w:w="851" w:type="dxa"/>
-        </w:tcPr>
-        <w:p>
-          <w:pPr>
-            <w:pStyle w:val="Pieddepage"/>
-            <w:jc w:val="center"/>
-            <w:rPr>
-              <w:rFonts w:asciiTheme="majorBidi" w:hAnsiTheme="majorBidi" w:cstheme="majorBidi"/>
-              <w:sz w:val="20"/>
-              <w:szCs w:val="20"/>
-              <w:rtl/>
-            </w:rPr>
-          </w:pPr>
-          <w:r>
-            <w:rPr>
-              <w:rFonts w:asciiTheme="majorBidi" w:hAnsiTheme="majorBidi" w:cstheme="majorBidi" w:hint="cs"/>
-              <w:sz w:val="20"/>
-              <w:szCs w:val="20"/>
-              <w:rtl/>
-            </w:rPr>
-            <w:t>النسخة القانونية</w:t>
-          </w:r>
-        </w:p>
-      </w:tc>
-      <w:tc>
-        <w:tcPr>
-          <w:tcW w:w="851" w:type="dxa"/>
-          <w:vAlign w:val="center"/>
-        </w:tcPr>
-        <w:p>
-          <w:pPr>
-            <w:pStyle w:val="Pieddepage"/>
-            <w:jc w:val="center"/>
-            <w:rPr>
-              <w:rFonts w:asciiTheme="majorBidi" w:hAnsiTheme="majorBidi" w:cstheme="majorBidi"/>
-              <w:sz w:val="20"/>
-              <w:szCs w:val="20"/>
-            </w:rPr>
-          </w:pPr>
-          <w:r>
-            <w:rPr>
-              <w:rFonts w:asciiTheme="majorBidi" w:hAnsiTheme="majorBidi" w:cstheme="majorBidi"/>
-              <w:sz w:val="20"/>
-              <w:szCs w:val="20"/>
-              <w:rtl/>
-            </w:rPr>
-            <w:t>النظائر</w:t>
-          </w:r>
-        </w:p>
-      </w:tc>
-      <w:tc>
-        <w:tcPr>
-          <w:tcW w:w="851" w:type="dxa"/>
-          <w:vAlign w:val="center"/>
-        </w:tcPr>
-        <w:p>
-          <w:pPr>
-            <w:pStyle w:val="Pieddepage"/>
-            <w:jc w:val="center"/>
-            <w:rPr>
-              <w:rFonts w:asciiTheme="majorBidi" w:hAnsiTheme="majorBidi" w:cstheme="majorBidi"/>
-              <w:sz w:val="20"/>
-              <w:szCs w:val="20"/>
-            </w:rPr>
-          </w:pPr>
-          <w:r>
-            <w:rPr>
-              <w:rFonts w:asciiTheme="majorBidi" w:hAnsiTheme="majorBidi" w:cstheme="majorBidi"/>
-              <w:sz w:val="20"/>
-              <w:szCs w:val="20"/>
-              <w:rtl/>
-            </w:rPr>
-            <w:t>أصل المحضر</w:t>
-          </w:r>
-        </w:p>
-      </w:tc>
-    </w:tr>
-    <w:tr>
-      <w:trPr>
-        <w:jc w:val="center"/>
-      </w:trPr>
-      <w:tc>
-        <w:tcPr>
-          <w:tcW w:w="851" w:type="dxa"/>
-        </w:tcPr>
-        <w:p>
-          <w:pPr>
-            <w:pStyle w:val="Pieddepage"/>
-            <w:jc w:val="center"/>
-          </w:pPr>
-        </w:p>
-      </w:tc>
-      <w:tc>
-        <w:tcPr>
-          <w:tcW w:w="851" w:type="dxa"/>
-        </w:tcPr>
-        <w:p>
-          <w:pPr>
-            <w:pStyle w:val="Pieddepage"/>
-            <w:jc w:val="center"/>
-          </w:pPr>
-        </w:p>
-      </w:tc>
-      <w:tc>
-        <w:tcPr>
-          <w:tcW w:w="851" w:type="dxa"/>
-        </w:tcPr>
-        <w:p>
-          <w:pPr>
-            <w:pStyle w:val="Pieddepage"/>
-            <w:jc w:val="center"/>
-          </w:pPr>
-          <w:r>
-            <w:rPr>
-              <w:rFonts w:hint="cs"/>
-              <w:rtl/>
-            </w:rPr>
-            <w:t>200</w:t>
-          </w:r>
-        </w:p>
-      </w:tc>
-      <w:tc>
-        <w:tcPr>
-          <w:tcW w:w="851" w:type="dxa"/>
-        </w:tcPr>
-        <w:p>
-          <w:pPr>
-            <w:pStyle w:val="Pieddepage"/>
-            <w:jc w:val="center"/>
-          </w:pPr>
-          <w:r>
-            <w:rPr>
-              <w:rFonts w:hint="cs"/>
-              <w:rtl/>
-            </w:rPr>
-            <w:t>30000</w:t>
-          </w:r>
-        </w:p>
-      </w:tc>
-      <w:tc>
-        <w:tcPr>
-          <w:tcW w:w="851" w:type="dxa"/>
-        </w:tcPr>
-        <w:p>
-          <w:pPr>
-            <w:pStyle w:val="Pieddepage"/>
-            <w:jc w:val="center"/>
-          </w:pPr>
-        </w:p>
-      </w:tc>
-      <w:tc>
-        <w:tcPr>
-          <w:tcW w:w="851" w:type="dxa"/>
-        </w:tcPr>
-        <w:p>
-          <w:pPr>
-            <w:pStyle w:val="Pieddepage"/>
-            <w:jc w:val="center"/>
-          </w:pPr>
-        </w:p>
-      </w:tc>
-      <w:tc>
-        <w:tcPr>
-          <w:tcW w:w="851" w:type="dxa"/>
-        </w:tcPr>
-        <w:p>
-          <w:pPr>
-            <w:pStyle w:val="Pieddepage"/>
-            <w:jc w:val="center"/>
-          </w:pPr>
-        </w:p>
-      </w:tc>
-      <w:tc>
-        <w:tcPr>
-          <w:tcW w:w="851" w:type="dxa"/>
-        </w:tcPr>
-        <w:p>
-          <w:pPr>
-            <w:pStyle w:val="Pieddepage"/>
-            <w:jc w:val="center"/>
-          </w:pPr>
-        </w:p>
-      </w:tc>
-      <w:tc>
-        <w:tcPr>
-          <w:tcW w:w="851" w:type="dxa"/>
-        </w:tcPr>
-        <w:p>
-          <w:pPr>
-            <w:pStyle w:val="Pieddepage"/>
-            <w:jc w:val="center"/>
-          </w:pPr>
-          <w:r>
-            <w:t>10 000</w:t>
-          </w:r>
-        </w:p>
-      </w:tc>
-      <w:tc>
-        <w:tcPr>
-          <w:tcW w:w="851" w:type="dxa"/>
-        </w:tcPr>
-        <w:p>
-          <w:pPr>
-            <w:pStyle w:val="Pieddepage"/>
-            <w:jc w:val="center"/>
-          </w:pPr>
-          <w:r>
-            <w:t>10 000</w:t>
-          </w:r>
-        </w:p>
-      </w:tc>
-      <w:tc>
-        <w:tcPr>
-          <w:tcW w:w="851" w:type="dxa"/>
-        </w:tcPr>
-        <w:p>
-          <w:pPr>
-            <w:pStyle w:val="Pieddepage"/>
-            <w:jc w:val="center"/>
-          </w:pPr>
-        </w:p>
-      </w:tc>
-      <w:tc>
-        <w:tcPr>
-          <w:tcW w:w="851" w:type="dxa"/>
-        </w:tcPr>
-        <w:p>
-          <w:pPr>
-            <w:pStyle w:val="Pieddepage"/>
-            <w:jc w:val="center"/>
-          </w:pPr>
-          <w:r>
-            <w:t>30 000</w:t>
-          </w:r>
-        </w:p>
-      </w:tc>
-    </w:tr>
-  </w:tbl>
   <w:p>
     <w:pPr>
       <w:pStyle w:val="Pieddepage"/>

</xml_diff>

<commit_message>
Revert the floating fee table; keep it in flow and unsplittable
Anchoring the أجور table with tblpPr (cb924ac) broke the act badly:
verified in Word, a single act rendered as THREE pages with the table
stranded on page 3. Both anchor variants tried (vertAnchor margin and
page, with and without text-wrap distance) reproduced it, so the cause
is the floating table itself, not its parameters.

Drop tblpPr and keep the table in the normal flow. cantSplit/keepNext
stay, so the two rows can no longer be separated across a page break —
the split reported earlier.

Verified with Word automation: 1 act = 1 page, 3 acts = 3 pages, each
act's table wholly on its own page (top 632.5pt, bottom 650.5pt).

The table still sits higher than wanted; a fixed spacer can't fix that
(90pt reaches the bottom for a typical act but pushes a long one to a
second page), so bottom placement needs the footer approach instead.

Co-Authored-By: Claude Opus 5 <noreply@anthropic.com>
</commit_message>
<xml_diff>
--- a/server/assets/template_cnss.docx
+++ b/server/assets/template_cnss.docx
@@ -1731,7 +1731,6 @@
     <w:tbl>
       <w:tblPr>
         <w:tblStyle w:val="Grilledutableau"/>
-        <w:tblpPr w:leftFromText="180" w:rightFromText="180" w:vertAnchor="margin" w:horzAnchor="margin" w:tblpXSpec="center" w:tblpYSpec="bottom"/>
         <w:tblW w:w="10212" w:type="dxa"/>
         <w:jc w:val="center"/>
         <w:tblLayout w:type="fixed"/>
@@ -1753,6 +1752,7 @@
       </w:tblGrid>
       <w:tr>
         <w:trPr>
+          <w:cantSplit/>
           <w:jc w:val="center"/>
         </w:trPr>
         <w:tc>
@@ -1763,6 +1763,7 @@
           <w:p>
             <w:pPr>
               <w:pStyle w:val="Pieddepage"/>
+              <w:keepNext/>
               <w:jc w:val="center"/>
               <w:rPr>
                 <w:rFonts w:asciiTheme="majorBidi" w:hAnsiTheme="majorBidi" w:cstheme="majorBidi"/>
@@ -1789,6 +1790,7 @@
           <w:p>
             <w:pPr>
               <w:pStyle w:val="Pieddepage"/>
+              <w:keepNext/>
               <w:jc w:val="center"/>
               <w:rPr>
                 <w:rFonts w:asciiTheme="majorBidi" w:hAnsiTheme="majorBidi" w:cstheme="majorBidi"/>
@@ -1815,6 +1817,7 @@
           <w:p>
             <w:pPr>
               <w:pStyle w:val="Pieddepage"/>
+              <w:keepNext/>
               <w:jc w:val="center"/>
               <w:rPr>
                 <w:rFonts w:asciiTheme="majorBidi" w:hAnsiTheme="majorBidi" w:cstheme="majorBidi"/>
@@ -1841,6 +1844,7 @@
           <w:p>
             <w:pPr>
               <w:pStyle w:val="Pieddepage"/>
+              <w:keepNext/>
               <w:jc w:val="center"/>
               <w:rPr>
                 <w:rFonts w:asciiTheme="majorBidi" w:hAnsiTheme="majorBidi" w:cstheme="majorBidi"/>
@@ -1867,6 +1871,7 @@
           <w:p>
             <w:pPr>
               <w:pStyle w:val="Pieddepage"/>
+              <w:keepNext/>
               <w:jc w:val="center"/>
               <w:rPr>
                 <w:rFonts w:asciiTheme="majorBidi" w:hAnsiTheme="majorBidi" w:cstheme="majorBidi"/>
@@ -1893,6 +1898,7 @@
           <w:p>
             <w:pPr>
               <w:pStyle w:val="Pieddepage"/>
+              <w:keepNext/>
               <w:jc w:val="center"/>
               <w:rPr>
                 <w:rFonts w:asciiTheme="majorBidi" w:hAnsiTheme="majorBidi" w:cstheme="majorBidi"/>
@@ -1919,6 +1925,7 @@
           <w:p>
             <w:pPr>
               <w:pStyle w:val="Pieddepage"/>
+              <w:keepNext/>
               <w:jc w:val="center"/>
               <w:rPr>
                 <w:rFonts w:asciiTheme="majorBidi" w:hAnsiTheme="majorBidi" w:cstheme="majorBidi"/>
@@ -1945,6 +1952,7 @@
           <w:p>
             <w:pPr>
               <w:pStyle w:val="Pieddepage"/>
+              <w:keepNext/>
               <w:jc w:val="center"/>
               <w:rPr>
                 <w:rFonts w:asciiTheme="majorBidi" w:hAnsiTheme="majorBidi" w:cstheme="majorBidi"/>
@@ -1971,6 +1979,7 @@
           <w:p>
             <w:pPr>
               <w:pStyle w:val="Pieddepage"/>
+              <w:keepNext/>
               <w:jc w:val="center"/>
               <w:rPr>
                 <w:rFonts w:asciiTheme="majorBidi" w:hAnsiTheme="majorBidi" w:cstheme="majorBidi"/>
@@ -1996,6 +2005,7 @@
           <w:p>
             <w:pPr>
               <w:pStyle w:val="Pieddepage"/>
+              <w:keepNext/>
               <w:jc w:val="center"/>
               <w:rPr>
                 <w:rFonts w:asciiTheme="majorBidi" w:hAnsiTheme="majorBidi" w:cstheme="majorBidi"/>
@@ -2023,6 +2033,7 @@
           <w:p>
             <w:pPr>
               <w:pStyle w:val="Pieddepage"/>
+              <w:keepNext/>
               <w:jc w:val="center"/>
               <w:rPr>
                 <w:rFonts w:asciiTheme="majorBidi" w:hAnsiTheme="majorBidi" w:cstheme="majorBidi"/>
@@ -2049,6 +2060,7 @@
           <w:p>
             <w:pPr>
               <w:pStyle w:val="Pieddepage"/>
+              <w:keepNext/>
               <w:jc w:val="center"/>
               <w:rPr>
                 <w:rFonts w:asciiTheme="majorBidi" w:hAnsiTheme="majorBidi" w:cstheme="majorBidi"/>
@@ -2070,6 +2082,7 @@
       </w:tr>
       <w:tr>
         <w:trPr>
+          <w:cantSplit/>
           <w:jc w:val="center"/>
         </w:trPr>
         <w:tc>

</xml_diff>